<commit_message>
deploy vps phase 2
</commit_message>
<xml_diff>
--- a/templates/fee-notice-template.docx
+++ b/templates/fee-notice-template.docx
@@ -788,7 +788,7 @@
           <w:bCs w:val="0"/>
           <w:i/>
         </w:rPr>
-        <w:t>0</w:t>
+        <w:t>…</w:t>
       </w:r>
       <w:r>
         <w:rPr>
@@ -796,9 +796,8 @@
           <w:b w:val="0"/>
           <w:bCs w:val="0"/>
           <w:i/>
-          <w:lang w:val="vi-VN"/>
-        </w:rPr>
-        <w:t>5</w:t>
+        </w:rPr>
+        <w:t>/0</w:t>
       </w:r>
       <w:r>
         <w:rPr>
@@ -807,7 +806,7 @@
           <w:bCs w:val="0"/>
           <w:i/>
         </w:rPr>
-        <w:t>/0</w:t>
+        <w:t>1</w:t>
       </w:r>
       <w:r>
         <w:rPr>
@@ -816,7 +815,7 @@
           <w:bCs w:val="0"/>
           <w:i/>
         </w:rPr>
-        <w:t>1</w:t>
+        <w:t>-</w:t>
       </w:r>
       <w:r>
         <w:rPr>
@@ -825,7 +824,7 @@
           <w:bCs w:val="0"/>
           <w:i/>
         </w:rPr>
-        <w:t>-</w:t>
+        <w:t>TB</w:t>
       </w:r>
       <w:r>
         <w:rPr>
@@ -834,7 +833,7 @@
           <w:bCs w:val="0"/>
           <w:i/>
         </w:rPr>
-        <w:t>TB</w:t>
+        <w:t>TP</w:t>
       </w:r>
       <w:r>
         <w:rPr>
@@ -843,7 +842,7 @@
           <w:bCs w:val="0"/>
           <w:i/>
         </w:rPr>
-        <w:t>TP</w:t>
+        <w:t>-BQ</w:t>
       </w:r>
       <w:r>
         <w:rPr>
@@ -852,7 +851,7 @@
           <w:bCs w:val="0"/>
           <w:i/>
         </w:rPr>
-        <w:t>-BQ</w:t>
+        <w:t>T</w:t>
       </w:r>
       <w:r>
         <w:rPr>
@@ -860,8 +859,9 @@
           <w:b w:val="0"/>
           <w:bCs w:val="0"/>
           <w:i/>
-        </w:rPr>
-        <w:t>T</w:t>
+          <w:color w:val="000000" w:themeColor="text1"/>
+        </w:rPr>
+        <w:t>NOXHAD</w:t>
       </w:r>
       <w:r>
         <w:rPr>
@@ -870,8 +870,10 @@
           <w:bCs w:val="0"/>
           <w:i/>
           <w:color w:val="000000" w:themeColor="text1"/>
-        </w:rPr>
-        <w:t>NOXHAD</w:t>
+          <w:sz w:val="26"/>
+          <w:szCs w:val="26"/>
+        </w:rPr>
+        <w:t xml:space="preserve">   </w:t>
       </w:r>
       <w:r>
         <w:rPr>
@@ -879,11 +881,8 @@
           <w:b w:val="0"/>
           <w:bCs w:val="0"/>
           <w:i/>
-          <w:color w:val="000000" w:themeColor="text1"/>
-          <w:sz w:val="26"/>
-          <w:szCs w:val="26"/>
-        </w:rPr>
-        <w:t xml:space="preserve">   </w:t>
+        </w:rPr>
+        <w:t xml:space="preserve">                                 </w:t>
       </w:r>
       <w:r>
         <w:rPr>
@@ -892,7 +891,7 @@
           <w:bCs w:val="0"/>
           <w:i/>
         </w:rPr>
-        <w:t xml:space="preserve">                                 </w:t>
+        <w:t>An Hải</w:t>
       </w:r>
       <w:r>
         <w:rPr>
@@ -901,8 +900,9 @@
           <w:bCs w:val="0"/>
           <w:i/>
         </w:rPr>
-        <w:t>An Hải</w:t>
-      </w:r>
+        <w:t xml:space="preserve">, </w:t>
+      </w:r>
+      <w:proofErr w:type="spellStart"/>
       <w:r>
         <w:rPr>
           <w:rFonts w:ascii="Times New Roman" w:hAnsi="Times New Roman"/>
@@ -910,9 +910,9 @@
           <w:bCs w:val="0"/>
           <w:i/>
         </w:rPr>
-        <w:t xml:space="preserve">, </w:t>
-      </w:r>
-      <w:proofErr w:type="spellStart"/>
+        <w:t>ngày</w:t>
+      </w:r>
+      <w:proofErr w:type="spellEnd"/>
       <w:r>
         <w:rPr>
           <w:rFonts w:ascii="Times New Roman" w:hAnsi="Times New Roman"/>
@@ -920,9 +920,8 @@
           <w:bCs w:val="0"/>
           <w:i/>
         </w:rPr>
-        <w:t>ngày</w:t>
-      </w:r>
-      <w:proofErr w:type="spellEnd"/>
+        <w:t xml:space="preserve"> </w:t>
+      </w:r>
       <w:r>
         <w:rPr>
           <w:rFonts w:ascii="Times New Roman" w:hAnsi="Times New Roman"/>
@@ -930,7 +929,7 @@
           <w:bCs w:val="0"/>
           <w:i/>
         </w:rPr>
-        <w:t xml:space="preserve"> </w:t>
+        <w:t>…</w:t>
       </w:r>
       <w:r>
         <w:rPr>
@@ -939,8 +938,9 @@
           <w:bCs w:val="0"/>
           <w:i/>
         </w:rPr>
-        <w:t>01</w:t>
-      </w:r>
+        <w:t xml:space="preserve"> </w:t>
+      </w:r>
+      <w:proofErr w:type="spellStart"/>
       <w:r>
         <w:rPr>
           <w:rFonts w:ascii="Times New Roman" w:hAnsi="Times New Roman"/>
@@ -948,9 +948,9 @@
           <w:bCs w:val="0"/>
           <w:i/>
         </w:rPr>
-        <w:t xml:space="preserve"> </w:t>
-      </w:r>
-      <w:proofErr w:type="spellStart"/>
+        <w:t>tháng</w:t>
+      </w:r>
+      <w:proofErr w:type="spellEnd"/>
       <w:r>
         <w:rPr>
           <w:rFonts w:ascii="Times New Roman" w:hAnsi="Times New Roman"/>
@@ -958,9 +958,8 @@
           <w:bCs w:val="0"/>
           <w:i/>
         </w:rPr>
-        <w:t>tháng</w:t>
-      </w:r>
-      <w:proofErr w:type="spellEnd"/>
+        <w:t xml:space="preserve"> </w:t>
+      </w:r>
       <w:r>
         <w:rPr>
           <w:rFonts w:ascii="Times New Roman" w:hAnsi="Times New Roman"/>
@@ -968,17 +967,7 @@
           <w:bCs w:val="0"/>
           <w:i/>
         </w:rPr>
-        <w:t xml:space="preserve"> </w:t>
-      </w:r>
-      <w:r>
-        <w:rPr>
-          <w:rFonts w:ascii="Times New Roman" w:hAnsi="Times New Roman"/>
-          <w:b w:val="0"/>
-          <w:bCs w:val="0"/>
-          <w:i/>
-          <w:lang w:val="vi-VN"/>
-        </w:rPr>
-        <w:t>05</w:t>
+        <w:t>….</w:t>
       </w:r>
       <w:r>
         <w:rPr>
@@ -2999,7 +2988,7 @@
                           </pic:cNvPicPr>
                         </pic:nvPicPr>
                         <pic:blipFill>
-                          <a:blip r:embed="rId8" cstate="print">
+                          <a:blip r:embed="rId7" cstate="print">
                             <a:extLst>
                               <a:ext uri="{28A0092B-C50C-407E-A947-70E740481C1C}">
                                 <a14:useLocalDpi xmlns:a14="http://schemas.microsoft.com/office/drawing/2010/main" val="0"/>
@@ -3071,7 +3060,7 @@
                           </pic:cNvPicPr>
                         </pic:nvPicPr>
                         <pic:blipFill>
-                          <a:blip r:embed="rId8" cstate="print">
+                          <a:blip r:embed="rId7" cstate="print">
                             <a:extLst>
                               <a:ext uri="{28A0092B-C50C-407E-A947-70E740481C1C}">
                                 <a14:useLocalDpi xmlns:a14="http://schemas.microsoft.com/office/drawing/2010/main" val="0"/>
@@ -3153,7 +3142,7 @@
                           </pic:cNvPicPr>
                         </pic:nvPicPr>
                         <pic:blipFill>
-                          <a:blip r:embed="rId9">
+                          <a:blip r:embed="rId8">
                             <a:extLst>
                               <a:ext uri="{28A0092B-C50C-407E-A947-70E740481C1C}">
                                 <a14:useLocalDpi xmlns:a14="http://schemas.microsoft.com/office/drawing/2010/main" val="0"/>
@@ -3260,7 +3249,7 @@
       </w:r>
     </w:p>
     <w:sectPr>
-      <w:footerReference w:type="default" r:id="rId10"/>
+      <w:footerReference w:type="default" r:id="rId9"/>
       <w:pgSz w:w="12240" w:h="15840" w:code="1"/>
       <w:pgMar w:top="284" w:right="900" w:bottom="568" w:left="856" w:header="677" w:footer="0" w:gutter="562"/>
       <w:cols w:space="720"/>
@@ -5001,16 +4990,4 @@
     </a:ext>
   </a:extLst>
 </a:theme>
-</file>
-
-<file path=customXml/item1.xml><?xml version="1.0" encoding="utf-8"?>
-<b:Sources xmlns:b="http://schemas.openxmlformats.org/officeDocument/2006/bibliography" xmlns="http://schemas.openxmlformats.org/officeDocument/2006/bibliography" SelectedStyle="\APASixthEditionOfficeOnline.xsl" StyleName="APA" Version="6"/>
-</file>
-
-<file path=customXml/itemProps1.xml><?xml version="1.0" encoding="utf-8"?>
-<ds:datastoreItem xmlns:ds="http://schemas.openxmlformats.org/officeDocument/2006/customXml" ds:itemID="{5F612352-E432-45F7-B744-5477B06F6F33}">
-  <ds:schemaRefs>
-    <ds:schemaRef ds:uri="http://schemas.openxmlformats.org/officeDocument/2006/bibliography"/>
-  </ds:schemaRefs>
-</ds:datastoreItem>
 </file>
</xml_diff>